<commit_message>
starter code and base model
</commit_message>
<xml_diff>
--- a/CS4375_CoverPage.docx
+++ b/CS4375_CoverPage.docx
@@ -1,6 +1,6 @@
 
 <file path=word/document.xml><?xml version="1.0" encoding="utf-8"?>
-<w:document xmlns:wpc="http://schemas.microsoft.com/office/word/2010/wordprocessingCanvas" xmlns:mo="http://schemas.microsoft.com/office/mac/office/2008/main" xmlns:mc="http://schemas.openxmlformats.org/markup-compatibility/2006" xmlns:mv="urn:schemas-microsoft-com:mac:vml" xmlns:o="urn:schemas-microsoft-com:office:office" xmlns:r="http://schemas.openxmlformats.org/officeDocument/2006/relationships" xmlns:m="http://schemas.openxmlformats.org/officeDocument/2006/math" xmlns:v="urn:schemas-microsoft-com:vml" xmlns:wp14="http://schemas.microsoft.com/office/word/2010/wordprocessingDrawing" xmlns:wp="http://schemas.openxmlformats.org/drawingml/2006/wordprocessingDrawing" xmlns:w10="urn:schemas-microsoft-com:office:word" xmlns:w="http://schemas.openxmlformats.org/wordprocessingml/2006/main" xmlns:w14="http://schemas.microsoft.com/office/word/2010/wordml" xmlns:w15="http://schemas.microsoft.com/office/word/2012/wordml" xmlns:wpg="http://schemas.microsoft.com/office/word/2010/wordprocessingGroup" xmlns:wpi="http://schemas.microsoft.com/office/word/2010/wordprocessingInk" xmlns:wne="http://schemas.microsoft.com/office/word/2006/wordml" xmlns:wps="http://schemas.microsoft.com/office/word/2010/wordprocessingShape" mc:Ignorable="w14 w15 wp14">
+<w:document xmlns:wpc="http://schemas.microsoft.com/office/word/2010/wordprocessingCanvas" xmlns:cx="http://schemas.microsoft.com/office/drawing/2014/chartex" xmlns:cx1="http://schemas.microsoft.com/office/drawing/2015/9/8/chartex" xmlns:cx2="http://schemas.microsoft.com/office/drawing/2015/10/21/chartex" xmlns:cx3="http://schemas.microsoft.com/office/drawing/2016/5/9/chartex" xmlns:cx4="http://schemas.microsoft.com/office/drawing/2016/5/10/chartex" xmlns:cx5="http://schemas.microsoft.com/office/drawing/2016/5/11/chartex" xmlns:cx6="http://schemas.microsoft.com/office/drawing/2016/5/12/chartex" xmlns:cx7="http://schemas.microsoft.com/office/drawing/2016/5/13/chartex" xmlns:cx8="http://schemas.microsoft.com/office/drawing/2016/5/14/chartex" xmlns:mc="http://schemas.openxmlformats.org/markup-compatibility/2006" xmlns:aink="http://schemas.microsoft.com/office/drawing/2016/ink" xmlns:am3d="http://schemas.microsoft.com/office/drawing/2017/model3d" xmlns:o="urn:schemas-microsoft-com:office:office" xmlns:oel="http://schemas.microsoft.com/office/2019/extlst" xmlns:r="http://schemas.openxmlformats.org/officeDocument/2006/relationships" xmlns:m="http://schemas.openxmlformats.org/officeDocument/2006/math" xmlns:v="urn:schemas-microsoft-com:vml" xmlns:wp14="http://schemas.microsoft.com/office/word/2010/wordprocessingDrawing" xmlns:wp="http://schemas.openxmlformats.org/drawingml/2006/wordprocessingDrawing" xmlns:w10="urn:schemas-microsoft-com:office:word" xmlns:w="http://schemas.openxmlformats.org/wordprocessingml/2006/main" xmlns:w14="http://schemas.microsoft.com/office/word/2010/wordml" xmlns:w15="http://schemas.microsoft.com/office/word/2012/wordml" xmlns:w16cex="http://schemas.microsoft.com/office/word/2018/wordml/cex" xmlns:w16cid="http://schemas.microsoft.com/office/word/2016/wordml/cid" xmlns:w16="http://schemas.microsoft.com/office/word/2018/wordml" xmlns:w16du="http://schemas.microsoft.com/office/word/2023/wordml/word16du" xmlns:w16sdtdh="http://schemas.microsoft.com/office/word/2020/wordml/sdtdatahash" xmlns:w16sdtfl="http://schemas.microsoft.com/office/word/2024/wordml/sdtformatlock" xmlns:w16se="http://schemas.microsoft.com/office/word/2015/wordml/symex" xmlns:wpg="http://schemas.microsoft.com/office/word/2010/wordprocessingGroup" xmlns:wpi="http://schemas.microsoft.com/office/word/2010/wordprocessingInk" xmlns:wne="http://schemas.microsoft.com/office/word/2006/wordml" xmlns:wps="http://schemas.microsoft.com/office/word/2010/wordprocessingShape" mc:Ignorable="w14 w15 w16se w16cid w16 w16cex w16sdtdh w16sdtfl w16du wp14">
   <w:body>
     <w:p>
       <w:pPr>
@@ -29,15 +29,22 @@
           <w:sz w:val="56"/>
           <w:szCs w:val="56"/>
         </w:rPr>
-        <w:t>ASSIGNMENT ____________</w:t>
-      </w:r>
-    </w:p>
-    <w:p>
-      <w:pPr>
+        <w:t xml:space="preserve">ASSIGNMENT </w:t>
+      </w:r>
+      <w:r>
         <w:rPr>
           <w:sz w:val="56"/>
           <w:szCs w:val="56"/>
         </w:rPr>
+        <w:t>3</w:t>
+      </w:r>
+    </w:p>
+    <w:p>
+      <w:pPr>
+        <w:rPr>
+          <w:sz w:val="56"/>
+          <w:szCs w:val="56"/>
+        </w:rPr>
       </w:pPr>
     </w:p>
     <w:p>
@@ -62,6 +69,36 @@
           <w:szCs w:val="40"/>
         </w:rPr>
       </w:pPr>
+      <w:r>
+        <w:rPr>
+          <w:sz w:val="40"/>
+          <w:szCs w:val="40"/>
+        </w:rPr>
+        <w:t>Casey Nguyen, CXN220034</w:t>
+      </w:r>
+    </w:p>
+    <w:p>
+      <w:pPr>
+        <w:rPr>
+          <w:sz w:val="40"/>
+          <w:szCs w:val="40"/>
+        </w:rPr>
+      </w:pPr>
+      <w:r>
+        <w:rPr>
+          <w:sz w:val="40"/>
+          <w:szCs w:val="40"/>
+        </w:rPr>
+        <w:t>Nguyen Phuc Do, NPD220001</w:t>
+      </w:r>
+    </w:p>
+    <w:p>
+      <w:pPr>
+        <w:rPr>
+          <w:sz w:val="40"/>
+          <w:szCs w:val="40"/>
+        </w:rPr>
+      </w:pPr>
     </w:p>
     <w:p>
       <w:pPr>
@@ -108,16 +145,14 @@
           <w:sz w:val="40"/>
           <w:szCs w:val="40"/>
         </w:rPr>
-        <w:t xml:space="preserve"> ____________________</w:t>
-      </w:r>
-      <w:bookmarkStart w:id="0" w:name="_GoBack"/>
-      <w:bookmarkEnd w:id="0"/>
-      <w:r>
-        <w:rPr>
-          <w:sz w:val="40"/>
-          <w:szCs w:val="40"/>
-        </w:rPr>
         <w:t xml:space="preserve"> </w:t>
+      </w:r>
+      <w:r>
+        <w:rPr>
+          <w:sz w:val="40"/>
+          <w:szCs w:val="40"/>
+        </w:rPr>
+        <w:t>0</w:t>
       </w:r>
       <w:r>
         <w:rPr>
@@ -207,7 +242,7 @@
 </file>
 
 <file path=word/styles.xml><?xml version="1.0" encoding="utf-8"?>
-<w:styles xmlns:mc="http://schemas.openxmlformats.org/markup-compatibility/2006" xmlns:r="http://schemas.openxmlformats.org/officeDocument/2006/relationships" xmlns:w="http://schemas.openxmlformats.org/wordprocessingml/2006/main" xmlns:w14="http://schemas.microsoft.com/office/word/2010/wordml" xmlns:w15="http://schemas.microsoft.com/office/word/2012/wordml" mc:Ignorable="w14 w15">
+<w:styles xmlns:mc="http://schemas.openxmlformats.org/markup-compatibility/2006" xmlns:r="http://schemas.openxmlformats.org/officeDocument/2006/relationships" xmlns:w="http://schemas.openxmlformats.org/wordprocessingml/2006/main" xmlns:w14="http://schemas.microsoft.com/office/word/2010/wordml" xmlns:w15="http://schemas.microsoft.com/office/word/2012/wordml" xmlns:w16cex="http://schemas.microsoft.com/office/word/2018/wordml/cex" xmlns:w16cid="http://schemas.microsoft.com/office/word/2016/wordml/cid" xmlns:w16="http://schemas.microsoft.com/office/word/2018/wordml" xmlns:w16du="http://schemas.microsoft.com/office/word/2023/wordml/word16du" xmlns:w16sdtdh="http://schemas.microsoft.com/office/word/2020/wordml/sdtdatahash" xmlns:w16sdtfl="http://schemas.microsoft.com/office/word/2024/wordml/sdtformatlock" xmlns:w16se="http://schemas.microsoft.com/office/word/2015/wordml/symex" mc:Ignorable="w14 w15 w16se w16cid w16 w16cex w16sdtdh w16sdtfl w16du">
   <w:docDefaults>
     <w:rPrDefault>
       <w:rPr>
@@ -219,7 +254,7 @@
     </w:rPrDefault>
     <w:pPrDefault/>
   </w:docDefaults>
-  <w:latentStyles w:defLockedState="0" w:defUIPriority="99" w:defSemiHidden="0" w:defUnhideWhenUsed="0" w:defQFormat="0" w:count="380">
+  <w:latentStyles w:defLockedState="0" w:defUIPriority="99" w:defSemiHidden="0" w:defUnhideWhenUsed="0" w:defQFormat="0" w:count="376">
     <w:lsdException w:name="Normal" w:uiPriority="0" w:qFormat="1"/>
     <w:lsdException w:name="heading 1" w:uiPriority="9" w:qFormat="1"/>
     <w:lsdException w:name="heading 2" w:semiHidden="1" w:uiPriority="9" w:unhideWhenUsed="1" w:qFormat="1"/>
@@ -376,15 +411,6 @@
     <w:lsdException w:name="Balloon Text" w:semiHidden="1" w:unhideWhenUsed="1"/>
     <w:lsdException w:name="Table Grid" w:uiPriority="39"/>
     <w:lsdException w:name="Table Theme" w:semiHidden="1" w:unhideWhenUsed="1"/>
-    <w:lsdException w:name="Note Level 1" w:semiHidden="1" w:unhideWhenUsed="1"/>
-    <w:lsdException w:name="Note Level 2" w:semiHidden="1" w:unhideWhenUsed="1"/>
-    <w:lsdException w:name="Note Level 3" w:semiHidden="1" w:unhideWhenUsed="1"/>
-    <w:lsdException w:name="Note Level 4" w:semiHidden="1" w:unhideWhenUsed="1"/>
-    <w:lsdException w:name="Note Level 5" w:semiHidden="1" w:unhideWhenUsed="1"/>
-    <w:lsdException w:name="Note Level 6" w:semiHidden="1" w:unhideWhenUsed="1"/>
-    <w:lsdException w:name="Note Level 7" w:semiHidden="1" w:unhideWhenUsed="1"/>
-    <w:lsdException w:name="Note Level 8" w:semiHidden="1" w:unhideWhenUsed="1"/>
-    <w:lsdException w:name="Note Level 9" w:semiHidden="1" w:unhideWhenUsed="1"/>
     <w:lsdException w:name="Placeholder Text" w:semiHidden="1"/>
     <w:lsdException w:name="No Spacing" w:uiPriority="1" w:qFormat="1"/>
     <w:lsdException w:name="Light Shading" w:uiPriority="60"/>
@@ -608,7 +634,6 @@
   <w:style w:type="character" w:default="1" w:styleId="DefaultParagraphFont">
     <w:name w:val="Default Paragraph Font"/>
     <w:uiPriority w:val="1"/>
-    <w:semiHidden/>
     <w:unhideWhenUsed/>
   </w:style>
   <w:style w:type="table" w:default="1" w:styleId="TableNormal">

</xml_diff>